<commit_message>
Updated Readme instructions for Docker and the Final Report
</commit_message>
<xml_diff>
--- a/reports/FinalReport_ML_Gr25.docx
+++ b/reports/FinalReport_ML_Gr25.docx
@@ -23,12 +23,6 @@
         <w:gridCol w:w="9360"/>
       </w:tblGrid>
       <w:tr>
-        <w:tblPrEx>
-          <w:tblCellMar>
-            <w:top w:w="0" w:type="dxa"/>
-            <w:bottom w:w="0" w:type="dxa"/>
-          </w:tblCellMar>
-        </w:tblPrEx>
         <w:tc>
           <w:tcPr>
             <w:tcW w:w="9360" w:type="dxa"/>
@@ -71,15 +65,7 @@
                 <w:sz w:val="20"/>
                 <w:szCs w:val="20"/>
               </w:rPr>
-              <w:t xml:space="preserve">                                                          </w:t>
-            </w:r>
-            <w:r>
-              <w:rPr>
-                <w:color w:val="A0D8EF"/>
-                <w:sz w:val="20"/>
-                <w:szCs w:val="20"/>
-              </w:rPr>
-              <w:t>Project Summary Report</w:t>
+              <w:t xml:space="preserve">                                                          Project Summary Report</w:t>
             </w:r>
           </w:p>
           <w:p>
@@ -354,12 +340,6 @@
         <w:gridCol w:w="2360"/>
       </w:tblGrid>
       <w:tr>
-        <w:tblPrEx>
-          <w:tblCellMar>
-            <w:top w:w="0" w:type="dxa"/>
-            <w:bottom w:w="0" w:type="dxa"/>
-          </w:tblCellMar>
-        </w:tblPrEx>
         <w:tc>
           <w:tcPr>
             <w:tcW w:w="2100" w:type="dxa"/>
@@ -512,12 +492,6 @@
         </w:tc>
       </w:tr>
       <w:tr>
-        <w:tblPrEx>
-          <w:tblCellMar>
-            <w:top w:w="0" w:type="dxa"/>
-            <w:bottom w:w="0" w:type="dxa"/>
-          </w:tblCellMar>
-        </w:tblPrEx>
         <w:tc>
           <w:tcPr>
             <w:tcW w:w="2100" w:type="dxa"/>
@@ -660,12 +634,6 @@
         </w:tc>
       </w:tr>
       <w:tr>
-        <w:tblPrEx>
-          <w:tblCellMar>
-            <w:top w:w="0" w:type="dxa"/>
-            <w:bottom w:w="0" w:type="dxa"/>
-          </w:tblCellMar>
-        </w:tblPrEx>
         <w:tc>
           <w:tcPr>
             <w:tcW w:w="2100" w:type="dxa"/>
@@ -808,12 +776,6 @@
         </w:tc>
       </w:tr>
       <w:tr>
-        <w:tblPrEx>
-          <w:tblCellMar>
-            <w:top w:w="0" w:type="dxa"/>
-            <w:bottom w:w="0" w:type="dxa"/>
-          </w:tblCellMar>
-        </w:tblPrEx>
         <w:tc>
           <w:tcPr>
             <w:tcW w:w="2100" w:type="dxa"/>
@@ -957,12 +919,6 @@
         </w:tc>
       </w:tr>
       <w:tr>
-        <w:tblPrEx>
-          <w:tblCellMar>
-            <w:top w:w="0" w:type="dxa"/>
-            <w:bottom w:w="0" w:type="dxa"/>
-          </w:tblCellMar>
-        </w:tblPrEx>
         <w:tc>
           <w:tcPr>
             <w:tcW w:w="2100" w:type="dxa"/>
@@ -1105,12 +1061,6 @@
         </w:tc>
       </w:tr>
       <w:tr>
-        <w:tblPrEx>
-          <w:tblCellMar>
-            <w:top w:w="0" w:type="dxa"/>
-            <w:bottom w:w="0" w:type="dxa"/>
-          </w:tblCellMar>
-        </w:tblPrEx>
         <w:tc>
           <w:tcPr>
             <w:tcW w:w="2100" w:type="dxa"/>
@@ -1253,12 +1203,6 @@
         </w:tc>
       </w:tr>
       <w:tr>
-        <w:tblPrEx>
-          <w:tblCellMar>
-            <w:top w:w="0" w:type="dxa"/>
-            <w:bottom w:w="0" w:type="dxa"/>
-          </w:tblCellMar>
-        </w:tblPrEx>
         <w:tc>
           <w:tcPr>
             <w:tcW w:w="2100" w:type="dxa"/>
@@ -1401,12 +1345,6 @@
         </w:tc>
       </w:tr>
       <w:tr>
-        <w:tblPrEx>
-          <w:tblCellMar>
-            <w:top w:w="0" w:type="dxa"/>
-            <w:bottom w:w="0" w:type="dxa"/>
-          </w:tblCellMar>
-        </w:tblPrEx>
         <w:tc>
           <w:tcPr>
             <w:tcW w:w="2100" w:type="dxa"/>
@@ -1680,12 +1618,6 @@
         <w:gridCol w:w="2660"/>
       </w:tblGrid>
       <w:tr>
-        <w:tblPrEx>
-          <w:tblCellMar>
-            <w:top w:w="0" w:type="dxa"/>
-            <w:bottom w:w="0" w:type="dxa"/>
-          </w:tblCellMar>
-        </w:tblPrEx>
         <w:tc>
           <w:tcPr>
             <w:tcW w:w="2500" w:type="dxa"/>
@@ -1808,12 +1740,6 @@
         </w:tc>
       </w:tr>
       <w:tr>
-        <w:tblPrEx>
-          <w:tblCellMar>
-            <w:top w:w="0" w:type="dxa"/>
-            <w:bottom w:w="0" w:type="dxa"/>
-          </w:tblCellMar>
-        </w:tblPrEx>
         <w:tc>
           <w:tcPr>
             <w:tcW w:w="2500" w:type="dxa"/>
@@ -1928,12 +1854,6 @@
         </w:tc>
       </w:tr>
       <w:tr>
-        <w:tblPrEx>
-          <w:tblCellMar>
-            <w:top w:w="0" w:type="dxa"/>
-            <w:bottom w:w="0" w:type="dxa"/>
-          </w:tblCellMar>
-        </w:tblPrEx>
         <w:tc>
           <w:tcPr>
             <w:tcW w:w="2500" w:type="dxa"/>
@@ -2048,12 +1968,6 @@
         </w:tc>
       </w:tr>
       <w:tr>
-        <w:tblPrEx>
-          <w:tblCellMar>
-            <w:top w:w="0" w:type="dxa"/>
-            <w:bottom w:w="0" w:type="dxa"/>
-          </w:tblCellMar>
-        </w:tblPrEx>
         <w:tc>
           <w:tcPr>
             <w:tcW w:w="2500" w:type="dxa"/>
@@ -2168,12 +2082,6 @@
         </w:tc>
       </w:tr>
       <w:tr>
-        <w:tblPrEx>
-          <w:tblCellMar>
-            <w:top w:w="0" w:type="dxa"/>
-            <w:bottom w:w="0" w:type="dxa"/>
-          </w:tblCellMar>
-        </w:tblPrEx>
         <w:tc>
           <w:tcPr>
             <w:tcW w:w="2500" w:type="dxa"/>
@@ -2288,12 +2196,6 @@
         </w:tc>
       </w:tr>
       <w:tr>
-        <w:tblPrEx>
-          <w:tblCellMar>
-            <w:top w:w="0" w:type="dxa"/>
-            <w:bottom w:w="0" w:type="dxa"/>
-          </w:tblCellMar>
-        </w:tblPrEx>
         <w:tc>
           <w:tcPr>
             <w:tcW w:w="2500" w:type="dxa"/>
@@ -2478,19 +2380,7 @@
           <w:rPr>
             <w:rStyle w:val="Hyperlink"/>
           </w:rPr>
-          <w:t>github.com/Dib-Ali/cross-sectional-e</w:t>
-        </w:r>
-        <w:r>
-          <w:rPr>
-            <w:rStyle w:val="Hyperlink"/>
-          </w:rPr>
-          <w:t>q</w:t>
-        </w:r>
-        <w:r>
-          <w:rPr>
-            <w:rStyle w:val="Hyperlink"/>
-          </w:rPr>
-          <w:t>uity-ml</w:t>
+          <w:t>github.com/Dib-Ali/cross-sectional-equity-ml</w:t>
         </w:r>
       </w:hyperlink>
       <w:r>
@@ -2513,14 +2403,23 @@
         <w:rPr>
           <w:color w:val="1C2833"/>
         </w:rPr>
-        <w:t xml:space="preserve">Docker image: public image containing the full working project. </w:t>
+        <w:lastRenderedPageBreak/>
+        <w:t>Docker image: public image containing the full working project</w:t>
       </w:r>
       <w:r>
         <w:rPr>
           <w:color w:val="1C2833"/>
         </w:rPr>
-        <w:t>Included in the GitHub Repo.</w:t>
-      </w:r>
+        <w:t xml:space="preserve"> (instructions in GitHub Readme) : </w:t>
+      </w:r>
+      <w:hyperlink r:id="rId8" w:history="1">
+        <w:r>
+          <w:rPr>
+            <w:rStyle w:val="Hyperlink"/>
+          </w:rPr>
+          <w:t>https://hub.docker.com/r/antsxd/machine_learning_cross_sectional_equity_return_predictor</w:t>
+        </w:r>
+      </w:hyperlink>
     </w:p>
     <w:p>
       <w:pPr>
@@ -2535,7 +2434,6 @@
         <w:rPr>
           <w:color w:val="1C2833"/>
         </w:rPr>
-        <w:lastRenderedPageBreak/>
         <w:t>3-minute video demo</w:t>
       </w:r>
       <w:r>
@@ -2544,24 +2442,12 @@
         </w:rPr>
         <w:t xml:space="preserve">: </w:t>
       </w:r>
-      <w:hyperlink r:id="rId8" w:history="1">
+      <w:hyperlink r:id="rId9" w:history="1">
         <w:r>
           <w:rPr>
             <w:rStyle w:val="Hyperlink"/>
           </w:rPr>
-          <w:t>https://drive.g</w:t>
-        </w:r>
-        <w:r>
-          <w:rPr>
-            <w:rStyle w:val="Hyperlink"/>
-          </w:rPr>
-          <w:t>o</w:t>
-        </w:r>
-        <w:r>
-          <w:rPr>
-            <w:rStyle w:val="Hyperlink"/>
-          </w:rPr>
-          <w:t>ogle.com/drive/folders/1akdIjg4_t5P_9a3e5FFZAD-e_CPSoH3t?usp=sharing</w:t>
+          <w:t>https://drive.google.com/drive/folders/1akdIjg4_t5P_9a3e5FFZAD-e_CPSoH3t?usp=sharing</w:t>
         </w:r>
       </w:hyperlink>
     </w:p>
@@ -2681,7 +2567,7 @@
       </w:r>
     </w:p>
     <w:sectPr>
-      <w:footerReference w:type="default" r:id="rId9"/>
+      <w:footerReference w:type="default" r:id="rId10"/>
       <w:pgSz w:w="12240" w:h="15840"/>
       <w:pgMar w:top="1080" w:right="1260" w:bottom="1080" w:left="1260" w:header="708" w:footer="708" w:gutter="0"/>
       <w:cols w:space="720"/>

</xml_diff>